<commit_message>
Complete Task 4: OpenCV live webcam capture
</commit_message>
<xml_diff>
--- a/documentation/Task_02_CoppeliaSim_Arm_Skeleton_Engineering_Log.docx
+++ b/documentation/Task_02_CoppeliaSim_Arm_Skeleton_Engineering_Log.docx
@@ -2,6 +2,17 @@
 <file path=word/document.xml><?xml version="1.0" encoding="utf-8"?>
 <w:document xmlns:wpc="http://schemas.microsoft.com/office/word/2010/wordprocessingCanvas" xmlns:cx="http://schemas.microsoft.com/office/drawing/2014/chartex" xmlns:cx1="http://schemas.microsoft.com/office/drawing/2015/9/8/chartex" xmlns:cx2="http://schemas.microsoft.com/office/drawing/2015/10/21/chartex" xmlns:cx3="http://schemas.microsoft.com/office/drawing/2016/5/9/chartex" xmlns:cx4="http://schemas.microsoft.com/office/drawing/2016/5/10/chartex" xmlns:cx5="http://schemas.microsoft.com/office/drawing/2016/5/11/chartex" xmlns:cx6="http://schemas.microsoft.com/office/drawing/2016/5/12/chartex" xmlns:cx7="http://schemas.microsoft.com/office/drawing/2016/5/13/chartex" xmlns:cx8="http://schemas.microsoft.com/office/drawing/2016/5/14/chartex" xmlns:mc="http://schemas.openxmlformats.org/markup-compatibility/2006" xmlns:aink="http://schemas.microsoft.com/office/drawing/2016/ink" xmlns:am3d="http://schemas.microsoft.com/office/drawing/2017/model3d" xmlns:o="urn:schemas-microsoft-com:office:office" xmlns:oel="http://schemas.microsoft.com/office/2019/extlst" xmlns:r="http://schemas.openxmlformats.org/officeDocument/2006/relationships" xmlns:m="http://schemas.openxmlformats.org/officeDocument/2006/math" xmlns:v="urn:schemas-microsoft-com:vml" xmlns:wp14="http://schemas.microsoft.com/office/word/2010/wordprocessingDrawing" xmlns:wp="http://schemas.openxmlformats.org/drawingml/2006/wordprocessingDrawing" xmlns:w10="urn:schemas-microsoft-com:office:word" xmlns:w="http://schemas.openxmlformats.org/wordprocessingml/2006/main" xmlns:w14="http://schemas.microsoft.com/office/word/2010/wordml" xmlns:w15="http://schemas.microsoft.com/office/word/2012/wordml" xmlns:w16cex="http://schemas.microsoft.com/office/word/2018/wordml/cex" xmlns:w16cid="http://schemas.microsoft.com/office/word/2016/wordml/cid" xmlns:w16="http://schemas.microsoft.com/office/word/2018/wordml" xmlns:w16du="http://schemas.microsoft.com/office/word/2023/wordml/word16du" xmlns:w16sdtdh="http://schemas.microsoft.com/office/word/2020/wordml/sdtdatahash" xmlns:w16sdtfl="http://schemas.microsoft.com/office/word/2024/wordml/sdtformatlock" xmlns:w16se="http://schemas.microsoft.com/office/word/2015/wordml/symex" xmlns:wpg="http://schemas.microsoft.com/office/word/2010/wordprocessingGroup" xmlns:wpi="http://schemas.microsoft.com/office/word/2010/wordprocessingInk" xmlns:wne="http://schemas.microsoft.com/office/word/2006/wordml" xmlns:wps="http://schemas.microsoft.com/office/word/2010/wordprocessingShape" mc:Ignorable="w14 w15 w16se w16cid w16 w16cex w16sdtdh w16sdtfl w16du wp14">
   <w:body>
+    <w:p>
+      <w:pPr>
+        <w:jc w:val="center"/>
+        <w:rPr>
+          <w:rFonts w:ascii="Aptos Display" w:hAnsi="Aptos Display"/>
+          <w:b/>
+          <w:color w:val="244C6E"/>
+          <w:sz w:val="44"/>
+        </w:rPr>
+      </w:pPr>
+    </w:p>
     <w:p>
       <w:pPr>
         <w:jc w:val="center"/>
@@ -729,6 +740,7 @@
           <w:p>
             <w:proofErr w:type="spellStart"/>
             <w:r>
+              <w:lastRenderedPageBreak/>
               <w:t>hand_palm</w:t>
             </w:r>
             <w:proofErr w:type="spellEnd"/>
@@ -757,7 +769,6 @@
         <w:pStyle w:val="Heading1"/>
       </w:pPr>
       <w:r>
-        <w:lastRenderedPageBreak/>
         <w:t>2. Final Kinematic Chain</w:t>
       </w:r>
     </w:p>
@@ -1443,6 +1454,7 @@
         <w:pStyle w:val="Heading1"/>
       </w:pPr>
       <w:r>
+        <w:lastRenderedPageBreak/>
         <w:t>4. Joint Orientation Decisions</w:t>
       </w:r>
     </w:p>
@@ -1489,7 +1501,6 @@
                 <w:b/>
                 <w:color w:val="FFFFFF"/>
               </w:rPr>
-              <w:lastRenderedPageBreak/>
               <w:t>Joint</w:t>
             </w:r>
           </w:p>
@@ -2117,6 +2128,7 @@
           </w:tcPr>
           <w:p>
             <w:r>
+              <w:lastRenderedPageBreak/>
               <w:t>Elbow</w:t>
             </w:r>
           </w:p>
@@ -2171,7 +2183,6 @@
           </w:tcPr>
           <w:p>
             <w:r>
-              <w:lastRenderedPageBreak/>
               <w:t>Wrist pitch</w:t>
             </w:r>
           </w:p>
@@ -2657,6 +2668,7 @@
           </w:tcPr>
           <w:p>
             <w:r>
+              <w:lastRenderedPageBreak/>
               <w:t>Elbow joint was initially too long and positioned alongside the upper arm.</w:t>
             </w:r>
           </w:p>
@@ -2727,7 +2739,6 @@
           </w:tcPr>
           <w:p>
             <w:r>
-              <w:lastRenderedPageBreak/>
               <w:t>Wrist pitch appeared diagonal.</w:t>
             </w:r>
           </w:p>
@@ -3191,6 +3202,7 @@
           </w:tcPr>
           <w:p>
             <w:r>
+              <w:lastRenderedPageBreak/>
               <w:t>Shoulder pitch</w:t>
             </w:r>
           </w:p>
@@ -3301,7 +3313,6 @@
           </w:tcPr>
           <w:p>
             <w:r>
-              <w:lastRenderedPageBreak/>
               <w:t>Wrist roll</w:t>
             </w:r>
           </w:p>
@@ -3459,45 +3470,9 @@
         </w:tc>
       </w:tr>
     </w:tbl>
-    <w:p>
-      <w:pPr>
-        <w:pStyle w:val="Heading1"/>
-      </w:pPr>
-      <w:r>
-        <w:t>9</w:t>
-      </w:r>
-      <w:r>
-        <w:t>. Next Task</w:t>
-      </w:r>
-    </w:p>
-    <w:p>
-      <w:r>
-        <w:rPr>
-          <w:b/>
-        </w:rPr>
-        <w:t xml:space="preserve">Task 3 — Python → </w:t>
-      </w:r>
-      <w:proofErr w:type="spellStart"/>
-      <w:r>
-        <w:rPr>
-          <w:b/>
-        </w:rPr>
-        <w:t>CoppeliaSim</w:t>
-      </w:r>
-      <w:proofErr w:type="spellEnd"/>
-      <w:r>
-        <w:rPr>
-          <w:b/>
-        </w:rPr>
-        <w:t xml:space="preserve"> Control. </w:t>
-      </w:r>
-      <w:r>
-        <w:t>The next objective is to control these same five joints from Python, proving the software can command the simulator before camera tracking is introduced.</w:t>
-      </w:r>
-    </w:p>
     <w:p/>
     <w:sectPr>
-      <w:footerReference w:type="default" r:id="rId5"/>
+      <w:footerReference w:type="default" r:id="rId7"/>
       <w:pgSz w:w="12240" w:h="15840"/>
       <w:pgMar w:top="936" w:right="1008" w:bottom="936" w:left="1008" w:header="720" w:footer="720" w:gutter="0"/>
       <w:cols w:space="720"/>
@@ -3505,6 +3480,31 @@
     </w:sectPr>
   </w:body>
 </w:document>
+</file>
+
+<file path=word/endnotes.xml><?xml version="1.0" encoding="utf-8"?>
+<w:endnotes xmlns:wpc="http://schemas.microsoft.com/office/word/2010/wordprocessingCanvas" xmlns:cx="http://schemas.microsoft.com/office/drawing/2014/chartex" xmlns:cx1="http://schemas.microsoft.com/office/drawing/2015/9/8/chartex" xmlns:cx2="http://schemas.microsoft.com/office/drawing/2015/10/21/chartex" xmlns:cx3="http://schemas.microsoft.com/office/drawing/2016/5/9/chartex" xmlns:cx4="http://schemas.microsoft.com/office/drawing/2016/5/10/chartex" xmlns:cx5="http://schemas.microsoft.com/office/drawing/2016/5/11/chartex" xmlns:cx6="http://schemas.microsoft.com/office/drawing/2016/5/12/chartex" xmlns:cx7="http://schemas.microsoft.com/office/drawing/2016/5/13/chartex" xmlns:cx8="http://schemas.microsoft.com/office/drawing/2016/5/14/chartex" xmlns:mc="http://schemas.openxmlformats.org/markup-compatibility/2006" xmlns:aink="http://schemas.microsoft.com/office/drawing/2016/ink" xmlns:am3d="http://schemas.microsoft.com/office/drawing/2017/model3d" xmlns:o="urn:schemas-microsoft-com:office:office" xmlns:oel="http://schemas.microsoft.com/office/2019/extlst" xmlns:r="http://schemas.openxmlformats.org/officeDocument/2006/relationships" xmlns:m="http://schemas.openxmlformats.org/officeDocument/2006/math" xmlns:v="urn:schemas-microsoft-com:vml" xmlns:wp14="http://schemas.microsoft.com/office/word/2010/wordprocessingDrawing" xmlns:wp="http://schemas.openxmlformats.org/drawingml/2006/wordprocessingDrawing" xmlns:w10="urn:schemas-microsoft-com:office:word" xmlns:w="http://schemas.openxmlformats.org/wordprocessingml/2006/main" xmlns:w14="http://schemas.microsoft.com/office/word/2010/wordml" xmlns:w15="http://schemas.microsoft.com/office/word/2012/wordml" xmlns:w16cex="http://schemas.microsoft.com/office/word/2018/wordml/cex" xmlns:w16cid="http://schemas.microsoft.com/office/word/2016/wordml/cid" xmlns:w16="http://schemas.microsoft.com/office/word/2018/wordml" xmlns:w16du="http://schemas.microsoft.com/office/word/2023/wordml/word16du" xmlns:w16sdtdh="http://schemas.microsoft.com/office/word/2020/wordml/sdtdatahash" xmlns:w16sdtfl="http://schemas.microsoft.com/office/word/2024/wordml/sdtformatlock" xmlns:w16se="http://schemas.microsoft.com/office/word/2015/wordml/symex" xmlns:wpg="http://schemas.microsoft.com/office/word/2010/wordprocessingGroup" xmlns:wpi="http://schemas.microsoft.com/office/word/2010/wordprocessingInk" xmlns:wne="http://schemas.microsoft.com/office/word/2006/wordml" xmlns:wps="http://schemas.microsoft.com/office/word/2010/wordprocessingShape" mc:Ignorable="w14 w15 w16se w16cid w16 w16cex w16sdtdh w16sdtfl w16du wp14">
+  <w:endnote w:type="separator" w:id="-1">
+    <w:p>
+      <w:pPr>
+        <w:spacing w:after="0" w:line="240" w:lineRule="auto"/>
+      </w:pPr>
+      <w:r>
+        <w:separator/>
+      </w:r>
+    </w:p>
+  </w:endnote>
+  <w:endnote w:type="continuationSeparator" w:id="0">
+    <w:p>
+      <w:pPr>
+        <w:spacing w:after="0" w:line="240" w:lineRule="auto"/>
+      </w:pPr>
+      <w:r>
+        <w:continuationSeparator/>
+      </w:r>
+    </w:p>
+  </w:endnote>
+</w:endnotes>
 </file>
 
 <file path=word/footer1.xml><?xml version="1.0" encoding="utf-8"?>
@@ -3523,6 +3523,31 @@
     </w:r>
   </w:p>
 </w:ftr>
+</file>
+
+<file path=word/footnotes.xml><?xml version="1.0" encoding="utf-8"?>
+<w:footnotes xmlns:wpc="http://schemas.microsoft.com/office/word/2010/wordprocessingCanvas" xmlns:cx="http://schemas.microsoft.com/office/drawing/2014/chartex" xmlns:cx1="http://schemas.microsoft.com/office/drawing/2015/9/8/chartex" xmlns:cx2="http://schemas.microsoft.com/office/drawing/2015/10/21/chartex" xmlns:cx3="http://schemas.microsoft.com/office/drawing/2016/5/9/chartex" xmlns:cx4="http://schemas.microsoft.com/office/drawing/2016/5/10/chartex" xmlns:cx5="http://schemas.microsoft.com/office/drawing/2016/5/11/chartex" xmlns:cx6="http://schemas.microsoft.com/office/drawing/2016/5/12/chartex" xmlns:cx7="http://schemas.microsoft.com/office/drawing/2016/5/13/chartex" xmlns:cx8="http://schemas.microsoft.com/office/drawing/2016/5/14/chartex" xmlns:mc="http://schemas.openxmlformats.org/markup-compatibility/2006" xmlns:aink="http://schemas.microsoft.com/office/drawing/2016/ink" xmlns:am3d="http://schemas.microsoft.com/office/drawing/2017/model3d" xmlns:o="urn:schemas-microsoft-com:office:office" xmlns:oel="http://schemas.microsoft.com/office/2019/extlst" xmlns:r="http://schemas.openxmlformats.org/officeDocument/2006/relationships" xmlns:m="http://schemas.openxmlformats.org/officeDocument/2006/math" xmlns:v="urn:schemas-microsoft-com:vml" xmlns:wp14="http://schemas.microsoft.com/office/word/2010/wordprocessingDrawing" xmlns:wp="http://schemas.openxmlformats.org/drawingml/2006/wordprocessingDrawing" xmlns:w10="urn:schemas-microsoft-com:office:word" xmlns:w="http://schemas.openxmlformats.org/wordprocessingml/2006/main" xmlns:w14="http://schemas.microsoft.com/office/word/2010/wordml" xmlns:w15="http://schemas.microsoft.com/office/word/2012/wordml" xmlns:w16cex="http://schemas.microsoft.com/office/word/2018/wordml/cex" xmlns:w16cid="http://schemas.microsoft.com/office/word/2016/wordml/cid" xmlns:w16="http://schemas.microsoft.com/office/word/2018/wordml" xmlns:w16du="http://schemas.microsoft.com/office/word/2023/wordml/word16du" xmlns:w16sdtdh="http://schemas.microsoft.com/office/word/2020/wordml/sdtdatahash" xmlns:w16sdtfl="http://schemas.microsoft.com/office/word/2024/wordml/sdtformatlock" xmlns:w16se="http://schemas.microsoft.com/office/word/2015/wordml/symex" xmlns:wpg="http://schemas.microsoft.com/office/word/2010/wordprocessingGroup" xmlns:wpi="http://schemas.microsoft.com/office/word/2010/wordprocessingInk" xmlns:wne="http://schemas.microsoft.com/office/word/2006/wordml" xmlns:wps="http://schemas.microsoft.com/office/word/2010/wordprocessingShape" mc:Ignorable="w14 w15 w16se w16cid w16 w16cex w16sdtdh w16sdtfl w16du wp14">
+  <w:footnote w:type="separator" w:id="-1">
+    <w:p>
+      <w:pPr>
+        <w:spacing w:after="0" w:line="240" w:lineRule="auto"/>
+      </w:pPr>
+      <w:r>
+        <w:separator/>
+      </w:r>
+    </w:p>
+  </w:footnote>
+  <w:footnote w:type="continuationSeparator" w:id="0">
+    <w:p>
+      <w:pPr>
+        <w:spacing w:after="0" w:line="240" w:lineRule="auto"/>
+      </w:pPr>
+      <w:r>
+        <w:continuationSeparator/>
+      </w:r>
+    </w:p>
+  </w:footnote>
+</w:footnotes>
 </file>
 
 <file path=word/numbering.xml><?xml version="1.0" encoding="utf-8"?>

</xml_diff>